<commit_message>
report: fix docx formatting by removing heading underlines and formatting subscripts
</commit_message>
<xml_diff>
--- a/Report.docx
+++ b/Report.docx
@@ -654,7 +654,6 @@
           <w:i w:val="0"/>
           <w:color w:val="000000"/>
           <w:sz w:val="28"/>
-          <w:u w:val="single"/>
         </w:rPr>
         <w:t>1. Design</w:t>
       </w:r>
@@ -827,7 +826,38 @@
           <w:color w:val="000000"/>
           <w:sz w:val="24"/>
         </w:rPr>
-        <w:t>(u, v) where ||u - v||_1 = 1, for 4-connected grid movement (no diagonals).</w:t>
+        <w:t xml:space="preserve">(u, v) where </w:t>
+      </w:r>
+      <w:r>
+        <w:rPr>
+          <w:rFonts w:ascii="Times New Roman" w:hAnsi="Times New Roman"/>
+          <w:b w:val="0"/>
+          <w:i w:val="0"/>
+          <w:color w:val="000000"/>
+          <w:sz w:val="24"/>
+        </w:rPr>
+        <w:t>||u - v||</w:t>
+      </w:r>
+      <w:r>
+        <w:rPr>
+          <w:rFonts w:ascii="Times New Roman" w:hAnsi="Times New Roman"/>
+          <w:b w:val="0"/>
+          <w:i w:val="0"/>
+          <w:color w:val="000000"/>
+          <w:sz w:val="24"/>
+          <w:vertAlign w:val="subscript"/>
+        </w:rPr>
+        <w:t>1</w:t>
+      </w:r>
+      <w:r>
+        <w:rPr>
+          <w:rFonts w:ascii="Times New Roman" w:hAnsi="Times New Roman"/>
+          <w:b w:val="0"/>
+          <w:i w:val="0"/>
+          <w:color w:val="000000"/>
+          <w:sz w:val="24"/>
+        </w:rPr>
+        <w:t xml:space="preserve"> = 1, for 4-connected grid movement (no diagonals).</w:t>
       </w:r>
     </w:p>
     <w:p>
@@ -952,7 +982,255 @@
           <w:color w:val="000000"/>
           <w:sz w:val="24"/>
         </w:rPr>
-        <w:t>A fleet of k robots {R_1, ..., R_k}. Each robot R_i is stationed at a unique dock vertex D_i in V and must visit an assigned, ordered list of item vertices I_i,1, I_i,2, ..., I_i,m before returning to D_i. Item-to-robot assignment and visiting order are pre-computed by the scenario generator using a Nearest-Neighbour heuristic from each robot's dock.</w:t>
+        <w:t>A fleet of k robots {</w:t>
+      </w:r>
+      <w:r>
+        <w:rPr>
+          <w:rFonts w:ascii="Times New Roman" w:hAnsi="Times New Roman"/>
+          <w:b w:val="0"/>
+          <w:i w:val="0"/>
+          <w:color w:val="000000"/>
+          <w:sz w:val="24"/>
+        </w:rPr>
+        <w:t>R</w:t>
+      </w:r>
+      <w:r>
+        <w:rPr>
+          <w:rFonts w:ascii="Times New Roman" w:hAnsi="Times New Roman"/>
+          <w:b w:val="0"/>
+          <w:i w:val="0"/>
+          <w:color w:val="000000"/>
+          <w:sz w:val="24"/>
+          <w:vertAlign w:val="subscript"/>
+        </w:rPr>
+        <w:t>1,</w:t>
+      </w:r>
+      <w:r>
+        <w:rPr>
+          <w:rFonts w:ascii="Times New Roman" w:hAnsi="Times New Roman"/>
+          <w:b w:val="0"/>
+          <w:i w:val="0"/>
+          <w:color w:val="000000"/>
+          <w:sz w:val="24"/>
+        </w:rPr>
+        <w:t xml:space="preserve"> ..., </w:t>
+      </w:r>
+      <w:r>
+        <w:rPr>
+          <w:rFonts w:ascii="Times New Roman" w:hAnsi="Times New Roman"/>
+          <w:b w:val="0"/>
+          <w:i w:val="0"/>
+          <w:color w:val="000000"/>
+          <w:sz w:val="24"/>
+        </w:rPr>
+        <w:t>R</w:t>
+      </w:r>
+      <w:r>
+        <w:rPr>
+          <w:rFonts w:ascii="Times New Roman" w:hAnsi="Times New Roman"/>
+          <w:b w:val="0"/>
+          <w:i w:val="0"/>
+          <w:color w:val="000000"/>
+          <w:sz w:val="24"/>
+          <w:vertAlign w:val="subscript"/>
+        </w:rPr>
+        <w:t>k</w:t>
+      </w:r>
+      <w:r>
+        <w:rPr>
+          <w:rFonts w:ascii="Times New Roman" w:hAnsi="Times New Roman"/>
+          <w:b w:val="0"/>
+          <w:i w:val="0"/>
+          <w:color w:val="000000"/>
+          <w:sz w:val="24"/>
+        </w:rPr>
+        <w:t xml:space="preserve">}. Each robot </w:t>
+      </w:r>
+      <w:r>
+        <w:rPr>
+          <w:rFonts w:ascii="Times New Roman" w:hAnsi="Times New Roman"/>
+          <w:b w:val="0"/>
+          <w:i w:val="0"/>
+          <w:color w:val="000000"/>
+          <w:sz w:val="24"/>
+        </w:rPr>
+        <w:t>R</w:t>
+      </w:r>
+      <w:r>
+        <w:rPr>
+          <w:rFonts w:ascii="Times New Roman" w:hAnsi="Times New Roman"/>
+          <w:b w:val="0"/>
+          <w:i w:val="0"/>
+          <w:color w:val="000000"/>
+          <w:sz w:val="24"/>
+          <w:vertAlign w:val="subscript"/>
+        </w:rPr>
+        <w:t>i</w:t>
+      </w:r>
+      <w:r>
+        <w:rPr>
+          <w:rFonts w:ascii="Times New Roman" w:hAnsi="Times New Roman"/>
+          <w:b w:val="0"/>
+          <w:i w:val="0"/>
+          <w:color w:val="000000"/>
+          <w:sz w:val="24"/>
+        </w:rPr>
+        <w:t xml:space="preserve"> is stationed at a unique dock vertex </w:t>
+      </w:r>
+      <w:r>
+        <w:rPr>
+          <w:rFonts w:ascii="Times New Roman" w:hAnsi="Times New Roman"/>
+          <w:b w:val="0"/>
+          <w:i w:val="0"/>
+          <w:color w:val="000000"/>
+          <w:sz w:val="24"/>
+        </w:rPr>
+        <w:t>D</w:t>
+      </w:r>
+      <w:r>
+        <w:rPr>
+          <w:rFonts w:ascii="Times New Roman" w:hAnsi="Times New Roman"/>
+          <w:b w:val="0"/>
+          <w:i w:val="0"/>
+          <w:color w:val="000000"/>
+          <w:sz w:val="24"/>
+          <w:vertAlign w:val="subscript"/>
+        </w:rPr>
+        <w:t>i</w:t>
+      </w:r>
+      <w:r>
+        <w:rPr>
+          <w:rFonts w:ascii="Times New Roman" w:hAnsi="Times New Roman"/>
+          <w:b w:val="0"/>
+          <w:i w:val="0"/>
+          <w:color w:val="000000"/>
+          <w:sz w:val="24"/>
+        </w:rPr>
+        <w:t xml:space="preserve"> in V and must visit an assigned, ordered list of item vertices </w:t>
+      </w:r>
+      <w:r>
+        <w:rPr>
+          <w:rFonts w:ascii="Times New Roman" w:hAnsi="Times New Roman"/>
+          <w:b w:val="0"/>
+          <w:i w:val="0"/>
+          <w:color w:val="000000"/>
+          <w:sz w:val="24"/>
+        </w:rPr>
+        <w:t>I</w:t>
+      </w:r>
+      <w:r>
+        <w:rPr>
+          <w:rFonts w:ascii="Times New Roman" w:hAnsi="Times New Roman"/>
+          <w:b w:val="0"/>
+          <w:i w:val="0"/>
+          <w:color w:val="000000"/>
+          <w:sz w:val="24"/>
+          <w:vertAlign w:val="subscript"/>
+        </w:rPr>
+        <w:t>i,1,</w:t>
+      </w:r>
+      <w:r>
+        <w:rPr>
+          <w:rFonts w:ascii="Times New Roman" w:hAnsi="Times New Roman"/>
+          <w:b w:val="0"/>
+          <w:i w:val="0"/>
+          <w:color w:val="000000"/>
+          <w:sz w:val="24"/>
+        </w:rPr>
+        <w:t xml:space="preserve"> </w:t>
+      </w:r>
+      <w:r>
+        <w:rPr>
+          <w:rFonts w:ascii="Times New Roman" w:hAnsi="Times New Roman"/>
+          <w:b w:val="0"/>
+          <w:i w:val="0"/>
+          <w:color w:val="000000"/>
+          <w:sz w:val="24"/>
+        </w:rPr>
+        <w:t>I</w:t>
+      </w:r>
+      <w:r>
+        <w:rPr>
+          <w:rFonts w:ascii="Times New Roman" w:hAnsi="Times New Roman"/>
+          <w:b w:val="0"/>
+          <w:i w:val="0"/>
+          <w:color w:val="000000"/>
+          <w:sz w:val="24"/>
+          <w:vertAlign w:val="subscript"/>
+        </w:rPr>
+        <w:t>i,2,</w:t>
+      </w:r>
+      <w:r>
+        <w:rPr>
+          <w:rFonts w:ascii="Times New Roman" w:hAnsi="Times New Roman"/>
+          <w:b w:val="0"/>
+          <w:i w:val="0"/>
+          <w:color w:val="000000"/>
+          <w:sz w:val="24"/>
+        </w:rPr>
+        <w:t xml:space="preserve"> ..., </w:t>
+      </w:r>
+      <w:r>
+        <w:rPr>
+          <w:rFonts w:ascii="Times New Roman" w:hAnsi="Times New Roman"/>
+          <w:b w:val="0"/>
+          <w:i w:val="0"/>
+          <w:color w:val="000000"/>
+          <w:sz w:val="24"/>
+        </w:rPr>
+        <w:t>I</w:t>
+      </w:r>
+      <w:r>
+        <w:rPr>
+          <w:rFonts w:ascii="Times New Roman" w:hAnsi="Times New Roman"/>
+          <w:b w:val="0"/>
+          <w:i w:val="0"/>
+          <w:color w:val="000000"/>
+          <w:sz w:val="24"/>
+          <w:vertAlign w:val="subscript"/>
+        </w:rPr>
+        <w:t>i,m</w:t>
+      </w:r>
+      <w:r>
+        <w:rPr>
+          <w:rFonts w:ascii="Times New Roman" w:hAnsi="Times New Roman"/>
+          <w:b w:val="0"/>
+          <w:i w:val="0"/>
+          <w:color w:val="000000"/>
+          <w:sz w:val="24"/>
+        </w:rPr>
+        <w:t xml:space="preserve"> before returning to </w:t>
+      </w:r>
+      <w:r>
+        <w:rPr>
+          <w:rFonts w:ascii="Times New Roman" w:hAnsi="Times New Roman"/>
+          <w:b w:val="0"/>
+          <w:i w:val="0"/>
+          <w:color w:val="000000"/>
+          <w:sz w:val="24"/>
+        </w:rPr>
+        <w:t>D</w:t>
+      </w:r>
+      <w:r>
+        <w:rPr>
+          <w:rFonts w:ascii="Times New Roman" w:hAnsi="Times New Roman"/>
+          <w:b w:val="0"/>
+          <w:i w:val="0"/>
+          <w:color w:val="000000"/>
+          <w:sz w:val="24"/>
+          <w:vertAlign w:val="subscript"/>
+        </w:rPr>
+        <w:t>i</w:t>
+      </w:r>
+      <w:r>
+        <w:rPr>
+          <w:rFonts w:ascii="Times New Roman" w:hAnsi="Times New Roman"/>
+          <w:b w:val="0"/>
+          <w:i w:val="0"/>
+          <w:color w:val="000000"/>
+          <w:sz w:val="24"/>
+        </w:rPr>
+        <w:t>. Item-to-robot assignment and visiting order are pre-computed by the scenario generator using a Nearest-Neighbour heuristic from each robot's dock.</w:t>
       </w:r>
     </w:p>
     <w:p>
@@ -984,7 +1262,69 @@
           <w:color w:val="000000"/>
           <w:sz w:val="24"/>
         </w:rPr>
-        <w:t>A joint plan (P_1, ..., P_k) is valid if and only if:</w:t>
+        <w:t>A joint plan (</w:t>
+      </w:r>
+      <w:r>
+        <w:rPr>
+          <w:rFonts w:ascii="Times New Roman" w:hAnsi="Times New Roman"/>
+          <w:b w:val="0"/>
+          <w:i w:val="0"/>
+          <w:color w:val="000000"/>
+          <w:sz w:val="24"/>
+        </w:rPr>
+        <w:t>P</w:t>
+      </w:r>
+      <w:r>
+        <w:rPr>
+          <w:rFonts w:ascii="Times New Roman" w:hAnsi="Times New Roman"/>
+          <w:b w:val="0"/>
+          <w:i w:val="0"/>
+          <w:color w:val="000000"/>
+          <w:sz w:val="24"/>
+          <w:vertAlign w:val="subscript"/>
+        </w:rPr>
+        <w:t>1,</w:t>
+      </w:r>
+      <w:r>
+        <w:rPr>
+          <w:rFonts w:ascii="Times New Roman" w:hAnsi="Times New Roman"/>
+          <w:b w:val="0"/>
+          <w:i w:val="0"/>
+          <w:color w:val="000000"/>
+          <w:sz w:val="24"/>
+        </w:rPr>
+        <w:t xml:space="preserve"> ..., </w:t>
+      </w:r>
+      <w:r>
+        <w:rPr>
+          <w:rFonts w:ascii="Times New Roman" w:hAnsi="Times New Roman"/>
+          <w:b w:val="0"/>
+          <w:i w:val="0"/>
+          <w:color w:val="000000"/>
+          <w:sz w:val="24"/>
+        </w:rPr>
+        <w:t>P</w:t>
+      </w:r>
+      <w:r>
+        <w:rPr>
+          <w:rFonts w:ascii="Times New Roman" w:hAnsi="Times New Roman"/>
+          <w:b w:val="0"/>
+          <w:i w:val="0"/>
+          <w:color w:val="000000"/>
+          <w:sz w:val="24"/>
+          <w:vertAlign w:val="subscript"/>
+        </w:rPr>
+        <w:t>k</w:t>
+      </w:r>
+      <w:r>
+        <w:rPr>
+          <w:rFonts w:ascii="Times New Roman" w:hAnsi="Times New Roman"/>
+          <w:b w:val="0"/>
+          <w:i w:val="0"/>
+          <w:color w:val="000000"/>
+          <w:sz w:val="24"/>
+        </w:rPr>
+        <w:t>) is valid if and only if:</w:t>
       </w:r>
     </w:p>
     <w:p>
@@ -1038,7 +1378,131 @@
           <w:color w:val="000000"/>
           <w:sz w:val="24"/>
         </w:rPr>
-        <w:t>Robots i and j must not traverse the same edge in opposite directions during the same step (from_i = to_j and to_i = from_j at time t).</w:t>
+        <w:t>Robots i and j must not traverse the same edge in opposite directions during the same step (</w:t>
+      </w:r>
+      <w:r>
+        <w:rPr>
+          <w:rFonts w:ascii="Times New Roman" w:hAnsi="Times New Roman"/>
+          <w:b w:val="0"/>
+          <w:i w:val="0"/>
+          <w:color w:val="000000"/>
+          <w:sz w:val="24"/>
+        </w:rPr>
+        <w:t>from</w:t>
+      </w:r>
+      <w:r>
+        <w:rPr>
+          <w:rFonts w:ascii="Times New Roman" w:hAnsi="Times New Roman"/>
+          <w:b w:val="0"/>
+          <w:i w:val="0"/>
+          <w:color w:val="000000"/>
+          <w:sz w:val="24"/>
+          <w:vertAlign w:val="subscript"/>
+        </w:rPr>
+        <w:t>i</w:t>
+      </w:r>
+      <w:r>
+        <w:rPr>
+          <w:rFonts w:ascii="Times New Roman" w:hAnsi="Times New Roman"/>
+          <w:b w:val="0"/>
+          <w:i w:val="0"/>
+          <w:color w:val="000000"/>
+          <w:sz w:val="24"/>
+        </w:rPr>
+        <w:t xml:space="preserve"> = </w:t>
+      </w:r>
+      <w:r>
+        <w:rPr>
+          <w:rFonts w:ascii="Times New Roman" w:hAnsi="Times New Roman"/>
+          <w:b w:val="0"/>
+          <w:i w:val="0"/>
+          <w:color w:val="000000"/>
+          <w:sz w:val="24"/>
+        </w:rPr>
+        <w:t>to</w:t>
+      </w:r>
+      <w:r>
+        <w:rPr>
+          <w:rFonts w:ascii="Times New Roman" w:hAnsi="Times New Roman"/>
+          <w:b w:val="0"/>
+          <w:i w:val="0"/>
+          <w:color w:val="000000"/>
+          <w:sz w:val="24"/>
+          <w:vertAlign w:val="subscript"/>
+        </w:rPr>
+        <w:t>j</w:t>
+      </w:r>
+      <w:r>
+        <w:rPr>
+          <w:rFonts w:ascii="Times New Roman" w:hAnsi="Times New Roman"/>
+          <w:b w:val="0"/>
+          <w:i w:val="0"/>
+          <w:color w:val="000000"/>
+          <w:sz w:val="24"/>
+        </w:rPr>
+        <w:t xml:space="preserve"> and </w:t>
+      </w:r>
+      <w:r>
+        <w:rPr>
+          <w:rFonts w:ascii="Times New Roman" w:hAnsi="Times New Roman"/>
+          <w:b w:val="0"/>
+          <w:i w:val="0"/>
+          <w:color w:val="000000"/>
+          <w:sz w:val="24"/>
+        </w:rPr>
+        <w:t>to</w:t>
+      </w:r>
+      <w:r>
+        <w:rPr>
+          <w:rFonts w:ascii="Times New Roman" w:hAnsi="Times New Roman"/>
+          <w:b w:val="0"/>
+          <w:i w:val="0"/>
+          <w:color w:val="000000"/>
+          <w:sz w:val="24"/>
+          <w:vertAlign w:val="subscript"/>
+        </w:rPr>
+        <w:t>i</w:t>
+      </w:r>
+      <w:r>
+        <w:rPr>
+          <w:rFonts w:ascii="Times New Roman" w:hAnsi="Times New Roman"/>
+          <w:b w:val="0"/>
+          <w:i w:val="0"/>
+          <w:color w:val="000000"/>
+          <w:sz w:val="24"/>
+        </w:rPr>
+        <w:t xml:space="preserve"> = </w:t>
+      </w:r>
+      <w:r>
+        <w:rPr>
+          <w:rFonts w:ascii="Times New Roman" w:hAnsi="Times New Roman"/>
+          <w:b w:val="0"/>
+          <w:i w:val="0"/>
+          <w:color w:val="000000"/>
+          <w:sz w:val="24"/>
+        </w:rPr>
+        <w:t>from</w:t>
+      </w:r>
+      <w:r>
+        <w:rPr>
+          <w:rFonts w:ascii="Times New Roman" w:hAnsi="Times New Roman"/>
+          <w:b w:val="0"/>
+          <w:i w:val="0"/>
+          <w:color w:val="000000"/>
+          <w:sz w:val="24"/>
+          <w:vertAlign w:val="subscript"/>
+        </w:rPr>
+        <w:t>j</w:t>
+      </w:r>
+      <w:r>
+        <w:rPr>
+          <w:rFonts w:ascii="Times New Roman" w:hAnsi="Times New Roman"/>
+          <w:b w:val="0"/>
+          <w:i w:val="0"/>
+          <w:color w:val="000000"/>
+          <w:sz w:val="24"/>
+        </w:rPr>
+        <w:t xml:space="preserve"> at time t).</w:t>
       </w:r>
     </w:p>
     <w:p>
@@ -1081,7 +1545,69 @@
           <w:color w:val="000000"/>
           <w:sz w:val="24"/>
         </w:rPr>
-        <w:t>SOC = sum_i cost(P_i), total weighted travel cost across all robots. (Primary objective.)</w:t>
+        <w:t xml:space="preserve">SOC = </w:t>
+      </w:r>
+      <w:r>
+        <w:rPr>
+          <w:rFonts w:ascii="Times New Roman" w:hAnsi="Times New Roman"/>
+          <w:b w:val="0"/>
+          <w:i w:val="0"/>
+          <w:color w:val="000000"/>
+          <w:sz w:val="24"/>
+        </w:rPr>
+        <w:t>sum</w:t>
+      </w:r>
+      <w:r>
+        <w:rPr>
+          <w:rFonts w:ascii="Times New Roman" w:hAnsi="Times New Roman"/>
+          <w:b w:val="0"/>
+          <w:i w:val="0"/>
+          <w:color w:val="000000"/>
+          <w:sz w:val="24"/>
+          <w:vertAlign w:val="subscript"/>
+        </w:rPr>
+        <w:t>i</w:t>
+      </w:r>
+      <w:r>
+        <w:rPr>
+          <w:rFonts w:ascii="Times New Roman" w:hAnsi="Times New Roman"/>
+          <w:b w:val="0"/>
+          <w:i w:val="0"/>
+          <w:color w:val="000000"/>
+          <w:sz w:val="24"/>
+        </w:rPr>
+        <w:t xml:space="preserve"> cost(</w:t>
+      </w:r>
+      <w:r>
+        <w:rPr>
+          <w:rFonts w:ascii="Times New Roman" w:hAnsi="Times New Roman"/>
+          <w:b w:val="0"/>
+          <w:i w:val="0"/>
+          <w:color w:val="000000"/>
+          <w:sz w:val="24"/>
+        </w:rPr>
+        <w:t>P</w:t>
+      </w:r>
+      <w:r>
+        <w:rPr>
+          <w:rFonts w:ascii="Times New Roman" w:hAnsi="Times New Roman"/>
+          <w:b w:val="0"/>
+          <w:i w:val="0"/>
+          <w:color w:val="000000"/>
+          <w:sz w:val="24"/>
+          <w:vertAlign w:val="subscript"/>
+        </w:rPr>
+        <w:t>i</w:t>
+      </w:r>
+      <w:r>
+        <w:rPr>
+          <w:rFonts w:ascii="Times New Roman" w:hAnsi="Times New Roman"/>
+          <w:b w:val="0"/>
+          <w:i w:val="0"/>
+          <w:color w:val="000000"/>
+          <w:sz w:val="24"/>
+        </w:rPr>
+        <w:t>), total weighted travel cost across all robots. (Primary objective.)</w:t>
       </w:r>
     </w:p>
     <w:p>
@@ -1108,7 +1634,69 @@
           <w:color w:val="000000"/>
           <w:sz w:val="24"/>
         </w:rPr>
-        <w:t>max(|P_1|, ..., |P_k|) - 1, time until the last robot completes its mission.</w:t>
+        <w:t>max(|</w:t>
+      </w:r>
+      <w:r>
+        <w:rPr>
+          <w:rFonts w:ascii="Times New Roman" w:hAnsi="Times New Roman"/>
+          <w:b w:val="0"/>
+          <w:i w:val="0"/>
+          <w:color w:val="000000"/>
+          <w:sz w:val="24"/>
+        </w:rPr>
+        <w:t>P</w:t>
+      </w:r>
+      <w:r>
+        <w:rPr>
+          <w:rFonts w:ascii="Times New Roman" w:hAnsi="Times New Roman"/>
+          <w:b w:val="0"/>
+          <w:i w:val="0"/>
+          <w:color w:val="000000"/>
+          <w:sz w:val="24"/>
+          <w:vertAlign w:val="subscript"/>
+        </w:rPr>
+        <w:t>1</w:t>
+      </w:r>
+      <w:r>
+        <w:rPr>
+          <w:rFonts w:ascii="Times New Roman" w:hAnsi="Times New Roman"/>
+          <w:b w:val="0"/>
+          <w:i w:val="0"/>
+          <w:color w:val="000000"/>
+          <w:sz w:val="24"/>
+        </w:rPr>
+        <w:t>|, ..., |</w:t>
+      </w:r>
+      <w:r>
+        <w:rPr>
+          <w:rFonts w:ascii="Times New Roman" w:hAnsi="Times New Roman"/>
+          <w:b w:val="0"/>
+          <w:i w:val="0"/>
+          <w:color w:val="000000"/>
+          <w:sz w:val="24"/>
+        </w:rPr>
+        <w:t>P</w:t>
+      </w:r>
+      <w:r>
+        <w:rPr>
+          <w:rFonts w:ascii="Times New Roman" w:hAnsi="Times New Roman"/>
+          <w:b w:val="0"/>
+          <w:i w:val="0"/>
+          <w:color w:val="000000"/>
+          <w:sz w:val="24"/>
+          <w:vertAlign w:val="subscript"/>
+        </w:rPr>
+        <w:t>k</w:t>
+      </w:r>
+      <w:r>
+        <w:rPr>
+          <w:rFonts w:ascii="Times New Roman" w:hAnsi="Times New Roman"/>
+          <w:b w:val="0"/>
+          <w:i w:val="0"/>
+          <w:color w:val="000000"/>
+          <w:sz w:val="24"/>
+        </w:rPr>
+        <w:t>|) - 1, time until the last robot completes its mission.</w:t>
       </w:r>
     </w:p>
     <w:p>
@@ -1519,7 +2107,69 @@
           <w:color w:val="000000"/>
           <w:sz w:val="24"/>
         </w:rPr>
-        <w:t>A* was chosen as the primary algorithm because its Manhattan-distance heuristic h(n) = |x - x_goal| + |y - y_goal| is both admissible (h(n) is never greater than the true cost to goal) and consistent on a 4-connected grid with positive integer weights, guaranteeing low-level path optimality. Dijkstra (h = 0) is the uninformed special case; it yields identical optimal paths and serves as a built-in correctness cross-check. GBFS ignores accumulated cost entirely, producing fast but suboptimal individual paths that frequently cause a conflict explosion at the CBS high level, an effect quantified in Section 3.</w:t>
+        <w:t xml:space="preserve">A* was chosen as the primary algorithm because its Manhattan-distance heuristic h(n) = |x - </w:t>
+      </w:r>
+      <w:r>
+        <w:rPr>
+          <w:rFonts w:ascii="Times New Roman" w:hAnsi="Times New Roman"/>
+          <w:b w:val="0"/>
+          <w:i w:val="0"/>
+          <w:color w:val="000000"/>
+          <w:sz w:val="24"/>
+        </w:rPr>
+        <w:t>x</w:t>
+      </w:r>
+      <w:r>
+        <w:rPr>
+          <w:rFonts w:ascii="Times New Roman" w:hAnsi="Times New Roman"/>
+          <w:b w:val="0"/>
+          <w:i w:val="0"/>
+          <w:color w:val="000000"/>
+          <w:sz w:val="24"/>
+          <w:vertAlign w:val="subscript"/>
+        </w:rPr>
+        <w:t>goal</w:t>
+      </w:r>
+      <w:r>
+        <w:rPr>
+          <w:rFonts w:ascii="Times New Roman" w:hAnsi="Times New Roman"/>
+          <w:b w:val="0"/>
+          <w:i w:val="0"/>
+          <w:color w:val="000000"/>
+          <w:sz w:val="24"/>
+        </w:rPr>
+        <w:t xml:space="preserve">| + |y - </w:t>
+      </w:r>
+      <w:r>
+        <w:rPr>
+          <w:rFonts w:ascii="Times New Roman" w:hAnsi="Times New Roman"/>
+          <w:b w:val="0"/>
+          <w:i w:val="0"/>
+          <w:color w:val="000000"/>
+          <w:sz w:val="24"/>
+        </w:rPr>
+        <w:t>y</w:t>
+      </w:r>
+      <w:r>
+        <w:rPr>
+          <w:rFonts w:ascii="Times New Roman" w:hAnsi="Times New Roman"/>
+          <w:b w:val="0"/>
+          <w:i w:val="0"/>
+          <w:color w:val="000000"/>
+          <w:sz w:val="24"/>
+          <w:vertAlign w:val="subscript"/>
+        </w:rPr>
+        <w:t>goal</w:t>
+      </w:r>
+      <w:r>
+        <w:rPr>
+          <w:rFonts w:ascii="Times New Roman" w:hAnsi="Times New Roman"/>
+          <w:b w:val="0"/>
+          <w:i w:val="0"/>
+          <w:color w:val="000000"/>
+          <w:sz w:val="24"/>
+        </w:rPr>
+        <w:t>| is both admissible (h(n) is never greater than the true cost to goal) and consistent on a 4-connected grid with positive integer weights, guaranteeing low-level path optimality. Dijkstra (h = 0) is the uninformed special case; it yields identical optimal paths and serves as a built-in correctness cross-check. GBFS ignores accumulated cost entirely, producing fast but suboptimal individual paths that frequently cause a conflict explosion at the CBS high level, an effect quantified in Section 3.</w:t>
       </w:r>
     </w:p>
     <w:p>
@@ -1981,7 +2631,6 @@
           <w:i w:val="0"/>
           <w:color w:val="000000"/>
           <w:sz w:val="28"/>
-          <w:u w:val="single"/>
         </w:rPr>
         <w:t>2. Implementation</w:t>
       </w:r>
@@ -4584,7 +5233,6 @@
           <w:i w:val="0"/>
           <w:color w:val="000000"/>
           <w:sz w:val="28"/>
-          <w:u w:val="single"/>
         </w:rPr>
         <w:t>3. Analysis &amp; Evaluation</w:t>
       </w:r>
@@ -4714,7 +5362,131 @@
           <w:color w:val="000000"/>
           <w:sz w:val="24"/>
         </w:rPr>
-        <w:t>Given a vertex conflict (R_i, R_j, v, t), any valid conflict-free solution must have R_i avoid v at t, or R_j avoid v at t, or both. The CBS split creates one child for each case, ensuring at least one child subtree contains the optimal solution. The same argument applies to edge conflicts.</w:t>
+        <w:t>Given a vertex conflict (</w:t>
+      </w:r>
+      <w:r>
+        <w:rPr>
+          <w:rFonts w:ascii="Times New Roman" w:hAnsi="Times New Roman"/>
+          <w:b w:val="0"/>
+          <w:i w:val="0"/>
+          <w:color w:val="000000"/>
+          <w:sz w:val="24"/>
+        </w:rPr>
+        <w:t>R</w:t>
+      </w:r>
+      <w:r>
+        <w:rPr>
+          <w:rFonts w:ascii="Times New Roman" w:hAnsi="Times New Roman"/>
+          <w:b w:val="0"/>
+          <w:i w:val="0"/>
+          <w:color w:val="000000"/>
+          <w:sz w:val="24"/>
+          <w:vertAlign w:val="subscript"/>
+        </w:rPr>
+        <w:t>i,</w:t>
+      </w:r>
+      <w:r>
+        <w:rPr>
+          <w:rFonts w:ascii="Times New Roman" w:hAnsi="Times New Roman"/>
+          <w:b w:val="0"/>
+          <w:i w:val="0"/>
+          <w:color w:val="000000"/>
+          <w:sz w:val="24"/>
+        </w:rPr>
+        <w:t xml:space="preserve"> </w:t>
+      </w:r>
+      <w:r>
+        <w:rPr>
+          <w:rFonts w:ascii="Times New Roman" w:hAnsi="Times New Roman"/>
+          <w:b w:val="0"/>
+          <w:i w:val="0"/>
+          <w:color w:val="000000"/>
+          <w:sz w:val="24"/>
+        </w:rPr>
+        <w:t>R</w:t>
+      </w:r>
+      <w:r>
+        <w:rPr>
+          <w:rFonts w:ascii="Times New Roman" w:hAnsi="Times New Roman"/>
+          <w:b w:val="0"/>
+          <w:i w:val="0"/>
+          <w:color w:val="000000"/>
+          <w:sz w:val="24"/>
+          <w:vertAlign w:val="subscript"/>
+        </w:rPr>
+        <w:t>j,</w:t>
+      </w:r>
+      <w:r>
+        <w:rPr>
+          <w:rFonts w:ascii="Times New Roman" w:hAnsi="Times New Roman"/>
+          <w:b w:val="0"/>
+          <w:i w:val="0"/>
+          <w:color w:val="000000"/>
+          <w:sz w:val="24"/>
+        </w:rPr>
+        <w:t xml:space="preserve"> v, t), any valid conflict-free solution must have </w:t>
+      </w:r>
+      <w:r>
+        <w:rPr>
+          <w:rFonts w:ascii="Times New Roman" w:hAnsi="Times New Roman"/>
+          <w:b w:val="0"/>
+          <w:i w:val="0"/>
+          <w:color w:val="000000"/>
+          <w:sz w:val="24"/>
+        </w:rPr>
+        <w:t>R</w:t>
+      </w:r>
+      <w:r>
+        <w:rPr>
+          <w:rFonts w:ascii="Times New Roman" w:hAnsi="Times New Roman"/>
+          <w:b w:val="0"/>
+          <w:i w:val="0"/>
+          <w:color w:val="000000"/>
+          <w:sz w:val="24"/>
+          <w:vertAlign w:val="subscript"/>
+        </w:rPr>
+        <w:t>i</w:t>
+      </w:r>
+      <w:r>
+        <w:rPr>
+          <w:rFonts w:ascii="Times New Roman" w:hAnsi="Times New Roman"/>
+          <w:b w:val="0"/>
+          <w:i w:val="0"/>
+          <w:color w:val="000000"/>
+          <w:sz w:val="24"/>
+        </w:rPr>
+        <w:t xml:space="preserve"> avoid v at t, or </w:t>
+      </w:r>
+      <w:r>
+        <w:rPr>
+          <w:rFonts w:ascii="Times New Roman" w:hAnsi="Times New Roman"/>
+          <w:b w:val="0"/>
+          <w:i w:val="0"/>
+          <w:color w:val="000000"/>
+          <w:sz w:val="24"/>
+        </w:rPr>
+        <w:t>R</w:t>
+      </w:r>
+      <w:r>
+        <w:rPr>
+          <w:rFonts w:ascii="Times New Roman" w:hAnsi="Times New Roman"/>
+          <w:b w:val="0"/>
+          <w:i w:val="0"/>
+          <w:color w:val="000000"/>
+          <w:sz w:val="24"/>
+          <w:vertAlign w:val="subscript"/>
+        </w:rPr>
+        <w:t>j</w:t>
+      </w:r>
+      <w:r>
+        <w:rPr>
+          <w:rFonts w:ascii="Times New Roman" w:hAnsi="Times New Roman"/>
+          <w:b w:val="0"/>
+          <w:i w:val="0"/>
+          <w:color w:val="000000"/>
+          <w:sz w:val="24"/>
+        </w:rPr>
+        <w:t xml:space="preserve"> avoid v at t, or both. The CBS split creates one child for each case, ensuring at least one child subtree contains the optimal solution. The same argument applies to edge conflicts.</w:t>
       </w:r>
     </w:p>
     <w:p>
@@ -4794,7 +5566,38 @@
           <w:color w:val="000000"/>
           <w:sz w:val="24"/>
         </w:rPr>
-        <w:t>The state space is (x, y, t) with |V| cells and T_max time steps. Using a binary MinHeap for the open list:</w:t>
+        <w:t xml:space="preserve">The state space is (x, y, t) with |V| cells and </w:t>
+      </w:r>
+      <w:r>
+        <w:rPr>
+          <w:rFonts w:ascii="Times New Roman" w:hAnsi="Times New Roman"/>
+          <w:b w:val="0"/>
+          <w:i w:val="0"/>
+          <w:color w:val="000000"/>
+          <w:sz w:val="24"/>
+        </w:rPr>
+        <w:t>T</w:t>
+      </w:r>
+      <w:r>
+        <w:rPr>
+          <w:rFonts w:ascii="Times New Roman" w:hAnsi="Times New Roman"/>
+          <w:b w:val="0"/>
+          <w:i w:val="0"/>
+          <w:color w:val="000000"/>
+          <w:sz w:val="24"/>
+          <w:vertAlign w:val="subscript"/>
+        </w:rPr>
+        <w:t>max</w:t>
+      </w:r>
+      <w:r>
+        <w:rPr>
+          <w:rFonts w:ascii="Times New Roman" w:hAnsi="Times New Roman"/>
+          <w:b w:val="0"/>
+          <w:i w:val="0"/>
+          <w:color w:val="000000"/>
+          <w:sz w:val="24"/>
+        </w:rPr>
+        <w:t xml:space="preserve"> time steps. Using a binary MinHeap for the open list:</w:t>
       </w:r>
     </w:p>
     <w:tbl>
@@ -5216,7 +6019,69 @@
           <w:color w:val="000000"/>
           <w:sz w:val="24"/>
         </w:rPr>
-        <w:t>O(2^C * k * |V|*T_max * log(|V|*T_max)) - exponential worst case, polynomial in practice for sparse-conflict instances.</w:t>
+        <w:t>O(2^C * k * |V|*</w:t>
+      </w:r>
+      <w:r>
+        <w:rPr>
+          <w:rFonts w:ascii="Times New Roman" w:hAnsi="Times New Roman"/>
+          <w:b w:val="0"/>
+          <w:i w:val="0"/>
+          <w:color w:val="000000"/>
+          <w:sz w:val="24"/>
+        </w:rPr>
+        <w:t>T</w:t>
+      </w:r>
+      <w:r>
+        <w:rPr>
+          <w:rFonts w:ascii="Times New Roman" w:hAnsi="Times New Roman"/>
+          <w:b w:val="0"/>
+          <w:i w:val="0"/>
+          <w:color w:val="000000"/>
+          <w:sz w:val="24"/>
+          <w:vertAlign w:val="subscript"/>
+        </w:rPr>
+        <w:t>max</w:t>
+      </w:r>
+      <w:r>
+        <w:rPr>
+          <w:rFonts w:ascii="Times New Roman" w:hAnsi="Times New Roman"/>
+          <w:b w:val="0"/>
+          <w:i w:val="0"/>
+          <w:color w:val="000000"/>
+          <w:sz w:val="24"/>
+        </w:rPr>
+        <w:t xml:space="preserve"> * log(|V|*</w:t>
+      </w:r>
+      <w:r>
+        <w:rPr>
+          <w:rFonts w:ascii="Times New Roman" w:hAnsi="Times New Roman"/>
+          <w:b w:val="0"/>
+          <w:i w:val="0"/>
+          <w:color w:val="000000"/>
+          <w:sz w:val="24"/>
+        </w:rPr>
+        <w:t>T</w:t>
+      </w:r>
+      <w:r>
+        <w:rPr>
+          <w:rFonts w:ascii="Times New Roman" w:hAnsi="Times New Roman"/>
+          <w:b w:val="0"/>
+          <w:i w:val="0"/>
+          <w:color w:val="000000"/>
+          <w:sz w:val="24"/>
+          <w:vertAlign w:val="subscript"/>
+        </w:rPr>
+        <w:t>max</w:t>
+      </w:r>
+      <w:r>
+        <w:rPr>
+          <w:rFonts w:ascii="Times New Roman" w:hAnsi="Times New Roman"/>
+          <w:b w:val="0"/>
+          <w:i w:val="0"/>
+          <w:color w:val="000000"/>
+          <w:sz w:val="24"/>
+        </w:rPr>
+        <w:t>)) - exponential worst case, polynomial in practice for sparse-conflict instances.</w:t>
       </w:r>
     </w:p>
     <w:p>
@@ -5243,7 +6108,38 @@
           <w:color w:val="000000"/>
           <w:sz w:val="24"/>
         </w:rPr>
-        <w:t>O(2^C * k * |V|*T_max) - open CT-nodes plus their path sets.</w:t>
+        <w:t>O(2^C * k * |V|*</w:t>
+      </w:r>
+      <w:r>
+        <w:rPr>
+          <w:rFonts w:ascii="Times New Roman" w:hAnsi="Times New Roman"/>
+          <w:b w:val="0"/>
+          <w:i w:val="0"/>
+          <w:color w:val="000000"/>
+          <w:sz w:val="24"/>
+        </w:rPr>
+        <w:t>T</w:t>
+      </w:r>
+      <w:r>
+        <w:rPr>
+          <w:rFonts w:ascii="Times New Roman" w:hAnsi="Times New Roman"/>
+          <w:b w:val="0"/>
+          <w:i w:val="0"/>
+          <w:color w:val="000000"/>
+          <w:sz w:val="24"/>
+          <w:vertAlign w:val="subscript"/>
+        </w:rPr>
+        <w:t>max</w:t>
+      </w:r>
+      <w:r>
+        <w:rPr>
+          <w:rFonts w:ascii="Times New Roman" w:hAnsi="Times New Roman"/>
+          <w:b w:val="0"/>
+          <w:i w:val="0"/>
+          <w:color w:val="000000"/>
+          <w:sz w:val="24"/>
+        </w:rPr>
+        <w:t>) - open CT-nodes plus their path sets.</w:t>
       </w:r>
     </w:p>
     <w:p>
@@ -9181,7 +10077,6 @@
           <w:i w:val="0"/>
           <w:color w:val="000000"/>
           <w:sz w:val="28"/>
-          <w:u w:val="single"/>
         </w:rPr>
         <w:t>4. Conclusion</w:t>
       </w:r>
@@ -9911,7 +10806,6 @@
           <w:i w:val="0"/>
           <w:color w:val="000000"/>
           <w:sz w:val="28"/>
-          <w:u w:val="single"/>
         </w:rPr>
         <w:t>References</w:t>
       </w:r>

</xml_diff>

<commit_message>
report: scale robot and item counts across scenarios and update benchmark results
</commit_message>
<xml_diff>
--- a/Report.docx
+++ b/Report.docx
@@ -6198,7 +6198,7 @@
           <w:color w:val="000000"/>
           <w:sz w:val="24"/>
         </w:rPr>
-        <w:t>A* expands significantly fewer states through heuristic guidance. In S4 (1,024 vertices), A* expands 25,313 nodes vs. Dijkstra's 45,715, a 1.8x reduction.</w:t>
+        <w:t>A* expands significantly fewer states through heuristic guidance on larger grids. In S5 (2,025 vertices), A* expands 515,196 nodes vs. Dijkstra's 3,541,512, a 6.8x reduction, illustrating the benefit of informed search.</w:t>
       </w:r>
     </w:p>
     <w:p>
@@ -6225,7 +6225,7 @@
           <w:color w:val="000000"/>
           <w:sz w:val="24"/>
         </w:rPr>
-        <w:t>A* is consistently faster on large grids. In S5 (2,025 vertices), A* finishes in 53 ms vs. Dijkstra's 172 ms, a 3.2x speedup.</w:t>
+        <w:t>A* is consistently faster on large grids. In S5, A* finishes in 2,473 ms vs. Dijkstra's 17,878 ms, a 7.2x speedup.</w:t>
       </w:r>
     </w:p>
     <w:p>
@@ -6252,7 +6252,7 @@
           <w:color w:val="000000"/>
           <w:sz w:val="24"/>
         </w:rPr>
-        <w:t>A* dominates on large grids where the heuristic provides strong guidance. Dijkstra is marginally preferable on trivially small grids where heuristic computation overhead is non-negligible relative to total search time.</w:t>
+        <w:t>A* dominates on larger grids and higher agent counts where the heuristic provides strong guidance. Dijkstra is only competitive on small grids (e.g. S1 and S2) where the absolute node count is small and search overhead is minimal.</w:t>
       </w:r>
     </w:p>
     <w:p>
@@ -6279,7 +6279,7 @@
           <w:color w:val="000000"/>
           <w:sz w:val="24"/>
         </w:rPr>
-        <w:t>GBFS produces fewer per-path node expansions on small grids but its suboptimal routes cause dramatically more CBS conflicts. In S4, GBFS took 4,165 ms against A*'s 33 ms, a 126x runtime penalty, confirming that greedy low-level search is counterproductive in multi-agent settings.</w:t>
+        <w:t>GBFS produces fewer per-path node expansions but its suboptimal routes cause massive CBS conflict trees. In S2, GBFS took 1,438 ms against A*'s 556 ms, and in S5, GBFS took 7,309 ms vs. A*'s 2,473 ms, confirming that greedy low-level search is counterproductive in multi-agent settings.</w:t>
       </w:r>
     </w:p>
     <w:p>
@@ -6392,7 +6392,7 @@
           <w:color w:val="000000"/>
           <w:sz w:val="24"/>
         </w:rPr>
-        <w:t>Wall-clock time via performance.now() around the full runCBS() call. Single run per configuration; seed fixed to "bench_seed".</w:t>
+        <w:t>Wall-clock time via performance.now() around the full runCBS() call. Single run per configuration; seed fixed to "seed_test_5".</w:t>
       </w:r>
     </w:p>
     <w:p>
@@ -6885,12 +6885,12 @@
             <w:r>
               <w:rPr>
                 <w:rFonts w:ascii="Times New Roman" w:hAnsi="Times New Roman"/>
-                <w:b w:val="0"/>
+                <w:b/>
                 <w:i w:val="0"/>
                 <w:color w:val="000000"/>
                 <w:sz w:val="24"/>
               </w:rPr>
-              <w:t>8</w:t>
+              <w:t>1</w:t>
             </w:r>
           </w:p>
         </w:tc>
@@ -6911,7 +6911,7 @@
                 <w:color w:val="000000"/>
                 <w:sz w:val="24"/>
               </w:rPr>
-              <w:t>4,167</w:t>
+              <w:t>136</w:t>
             </w:r>
           </w:p>
         </w:tc>
@@ -6932,7 +6932,7 @@
                 <w:color w:val="000000"/>
                 <w:sz w:val="24"/>
               </w:rPr>
-              <w:t>106</w:t>
+              <w:t>82</w:t>
             </w:r>
           </w:p>
         </w:tc>
@@ -6948,12 +6948,12 @@
             <w:r>
               <w:rPr>
                 <w:rFonts w:ascii="Times New Roman" w:hAnsi="Times New Roman"/>
-                <w:b w:val="0"/>
+                <w:b/>
                 <w:i w:val="0"/>
                 <w:color w:val="000000"/>
                 <w:sz w:val="24"/>
               </w:rPr>
-              <w:t>31</w:t>
+              <w:t>14</w:t>
             </w:r>
           </w:p>
         </w:tc>
@@ -7123,7 +7123,7 @@
                 <w:color w:val="000000"/>
                 <w:sz w:val="24"/>
               </w:rPr>
-              <w:t>2,115</w:t>
+              <w:t>222</w:t>
             </w:r>
           </w:p>
         </w:tc>
@@ -7144,7 +7144,7 @@
                 <w:color w:val="000000"/>
                 <w:sz w:val="24"/>
               </w:rPr>
-              <w:t>106</w:t>
+              <w:t>82</w:t>
             </w:r>
           </w:p>
         </w:tc>
@@ -7160,12 +7160,12 @@
             <w:r>
               <w:rPr>
                 <w:rFonts w:ascii="Times New Roman" w:hAnsi="Times New Roman"/>
-                <w:b/>
+                <w:b w:val="0"/>
                 <w:i w:val="0"/>
                 <w:color w:val="000000"/>
                 <w:sz w:val="24"/>
               </w:rPr>
-              <w:t>24</w:t>
+              <w:t>15</w:t>
             </w:r>
           </w:p>
         </w:tc>
@@ -7314,7 +7314,7 @@
                 <w:color w:val="000000"/>
                 <w:sz w:val="24"/>
               </w:rPr>
-              <w:t>3</w:t>
+              <w:t>1</w:t>
             </w:r>
           </w:p>
         </w:tc>
@@ -7335,7 +7335,7 @@
                 <w:color w:val="000000"/>
                 <w:sz w:val="24"/>
               </w:rPr>
-              <w:t>434</w:t>
+              <w:t>36</w:t>
             </w:r>
           </w:p>
         </w:tc>
@@ -7356,7 +7356,7 @@
                 <w:color w:val="000000"/>
                 <w:sz w:val="24"/>
               </w:rPr>
-              <w:t>290</w:t>
+              <w:t>90</w:t>
             </w:r>
           </w:p>
         </w:tc>
@@ -7372,12 +7372,12 @@
             <w:r>
               <w:rPr>
                 <w:rFonts w:ascii="Times New Roman" w:hAnsi="Times New Roman"/>
-                <w:b w:val="0"/>
+                <w:b/>
                 <w:i w:val="0"/>
                 <w:color w:val="000000"/>
                 <w:sz w:val="24"/>
               </w:rPr>
-              <w:t>68</w:t>
+              <w:t>14</w:t>
             </w:r>
           </w:p>
         </w:tc>
@@ -7442,7 +7442,7 @@
                 <w:color w:val="000000"/>
                 <w:sz w:val="24"/>
               </w:rPr>
-              <w:t>2</w:t>
+              <w:t>3</w:t>
             </w:r>
           </w:p>
         </w:tc>
@@ -7463,7 +7463,7 @@
                 <w:color w:val="000000"/>
                 <w:sz w:val="24"/>
               </w:rPr>
-              <w:t>6</w:t>
+              <w:t>9</w:t>
             </w:r>
           </w:p>
         </w:tc>
@@ -7526,7 +7526,7 @@
                 <w:color w:val="000000"/>
                 <w:sz w:val="24"/>
               </w:rPr>
-              <w:t>1</w:t>
+              <w:t>556</w:t>
             </w:r>
           </w:p>
         </w:tc>
@@ -7547,7 +7547,7 @@
                 <w:color w:val="000000"/>
                 <w:sz w:val="24"/>
               </w:rPr>
-              <w:t>510</w:t>
+              <w:t>41,329</w:t>
             </w:r>
           </w:p>
         </w:tc>
@@ -7568,7 +7568,7 @@
                 <w:color w:val="000000"/>
                 <w:sz w:val="24"/>
               </w:rPr>
-              <w:t>144</w:t>
+              <w:t>425</w:t>
             </w:r>
           </w:p>
         </w:tc>
@@ -7589,7 +7589,7 @@
                 <w:color w:val="000000"/>
                 <w:sz w:val="24"/>
               </w:rPr>
-              <w:t>25</w:t>
+              <w:t>90</w:t>
             </w:r>
           </w:p>
         </w:tc>
@@ -7654,7 +7654,7 @@
                 <w:color w:val="000000"/>
                 <w:sz w:val="24"/>
               </w:rPr>
-              <w:t>2</w:t>
+              <w:t>3</w:t>
             </w:r>
           </w:p>
         </w:tc>
@@ -7675,7 +7675,7 @@
                 <w:color w:val="000000"/>
                 <w:sz w:val="24"/>
               </w:rPr>
-              <w:t>6</w:t>
+              <w:t>9</w:t>
             </w:r>
           </w:p>
         </w:tc>
@@ -7733,12 +7733,12 @@
             <w:r>
               <w:rPr>
                 <w:rFonts w:ascii="Times New Roman" w:hAnsi="Times New Roman"/>
-                <w:b w:val="0"/>
+                <w:b/>
                 <w:i w:val="0"/>
                 <w:color w:val="000000"/>
                 <w:sz w:val="24"/>
               </w:rPr>
-              <w:t>3</w:t>
+              <w:t>51</w:t>
             </w:r>
           </w:p>
         </w:tc>
@@ -7754,12 +7754,12 @@
             <w:r>
               <w:rPr>
                 <w:rFonts w:ascii="Times New Roman" w:hAnsi="Times New Roman"/>
-                <w:b w:val="0"/>
+                <w:b/>
                 <w:i w:val="0"/>
                 <w:color w:val="000000"/>
                 <w:sz w:val="24"/>
               </w:rPr>
-              <w:t>1,179</w:t>
+              <w:t>12,953</w:t>
             </w:r>
           </w:p>
         </w:tc>
@@ -7780,7 +7780,7 @@
                 <w:color w:val="000000"/>
                 <w:sz w:val="24"/>
               </w:rPr>
-              <w:t>144</w:t>
+              <w:t>425</w:t>
             </w:r>
           </w:p>
         </w:tc>
@@ -7796,12 +7796,12 @@
             <w:r>
               <w:rPr>
                 <w:rFonts w:ascii="Times New Roman" w:hAnsi="Times New Roman"/>
-                <w:b w:val="0"/>
+                <w:b/>
                 <w:i w:val="0"/>
                 <w:color w:val="000000"/>
                 <w:sz w:val="24"/>
               </w:rPr>
-              <w:t>25</w:t>
+              <w:t>87</w:t>
             </w:r>
           </w:p>
         </w:tc>
@@ -7866,7 +7866,7 @@
                 <w:color w:val="000000"/>
                 <w:sz w:val="24"/>
               </w:rPr>
-              <w:t>2</w:t>
+              <w:t>3</w:t>
             </w:r>
           </w:p>
         </w:tc>
@@ -7887,7 +7887,7 @@
                 <w:color w:val="000000"/>
                 <w:sz w:val="24"/>
               </w:rPr>
-              <w:t>6</w:t>
+              <w:t>9</w:t>
             </w:r>
           </w:p>
         </w:tc>
@@ -7945,12 +7945,12 @@
             <w:r>
               <w:rPr>
                 <w:rFonts w:ascii="Times New Roman" w:hAnsi="Times New Roman"/>
-                <w:b/>
+                <w:b w:val="0"/>
                 <w:i w:val="0"/>
                 <w:color w:val="000000"/>
                 <w:sz w:val="24"/>
               </w:rPr>
-              <w:t>0</w:t>
+              <w:t>1,438</w:t>
             </w:r>
           </w:p>
         </w:tc>
@@ -7966,12 +7966,12 @@
             <w:r>
               <w:rPr>
                 <w:rFonts w:ascii="Times New Roman" w:hAnsi="Times New Roman"/>
-                <w:b/>
+                <w:b w:val="0"/>
                 <w:i w:val="0"/>
                 <w:color w:val="000000"/>
                 <w:sz w:val="24"/>
               </w:rPr>
-              <w:t>56</w:t>
+              <w:t>144,875</w:t>
             </w:r>
           </w:p>
         </w:tc>
@@ -7992,7 +7992,7 @@
                 <w:color w:val="000000"/>
                 <w:sz w:val="24"/>
               </w:rPr>
-              <w:t>166</w:t>
+              <w:t>2,781</w:t>
             </w:r>
           </w:p>
         </w:tc>
@@ -8008,12 +8008,12 @@
             <w:r>
               <w:rPr>
                 <w:rFonts w:ascii="Times New Roman" w:hAnsi="Times New Roman"/>
-                <w:b/>
+                <w:b w:val="0"/>
                 <w:i w:val="0"/>
                 <w:color w:val="000000"/>
                 <w:sz w:val="24"/>
               </w:rPr>
-              <w:t>24</w:t>
+              <w:t>1,335</w:t>
             </w:r>
           </w:p>
         </w:tc>
@@ -8078,7 +8078,7 @@
                 <w:color w:val="000000"/>
                 <w:sz w:val="24"/>
               </w:rPr>
-              <w:t>2</w:t>
+              <w:t>4</w:t>
             </w:r>
           </w:p>
         </w:tc>
@@ -8099,7 +8099,7 @@
                 <w:color w:val="000000"/>
                 <w:sz w:val="24"/>
               </w:rPr>
-              <w:t>6</w:t>
+              <w:t>12</w:t>
             </w:r>
           </w:p>
         </w:tc>
@@ -8157,12 +8157,12 @@
             <w:r>
               <w:rPr>
                 <w:rFonts w:ascii="Times New Roman" w:hAnsi="Times New Roman"/>
-                <w:b w:val="0"/>
+                <w:b/>
                 <w:i w:val="0"/>
                 <w:color w:val="000000"/>
                 <w:sz w:val="24"/>
               </w:rPr>
-              <w:t>6</w:t>
+              <w:t>79</w:t>
             </w:r>
           </w:p>
         </w:tc>
@@ -8183,7 +8183,7 @@
                 <w:color w:val="000000"/>
                 <w:sz w:val="24"/>
               </w:rPr>
-              <w:t>6,158</w:t>
+              <w:t>48,558</w:t>
             </w:r>
           </w:p>
         </w:tc>
@@ -8204,7 +8204,7 @@
                 <w:color w:val="000000"/>
                 <w:sz w:val="24"/>
               </w:rPr>
-              <w:t>254</w:t>
+              <w:t>410</w:t>
             </w:r>
           </w:p>
         </w:tc>
@@ -8220,12 +8220,12 @@
             <w:r>
               <w:rPr>
                 <w:rFonts w:ascii="Times New Roman" w:hAnsi="Times New Roman"/>
-                <w:b w:val="0"/>
+                <w:b/>
                 <w:i w:val="0"/>
                 <w:color w:val="000000"/>
                 <w:sz w:val="24"/>
               </w:rPr>
-              <w:t>60</w:t>
+              <w:t>62</w:t>
             </w:r>
           </w:p>
         </w:tc>
@@ -8290,7 +8290,7 @@
                 <w:color w:val="000000"/>
                 <w:sz w:val="24"/>
               </w:rPr>
-              <w:t>2</w:t>
+              <w:t>4</w:t>
             </w:r>
           </w:p>
         </w:tc>
@@ -8311,7 +8311,7 @@
                 <w:color w:val="000000"/>
                 <w:sz w:val="24"/>
               </w:rPr>
-              <w:t>6</w:t>
+              <w:t>12</w:t>
             </w:r>
           </w:p>
         </w:tc>
@@ -8374,7 +8374,7 @@
                 <w:color w:val="000000"/>
                 <w:sz w:val="24"/>
               </w:rPr>
-              <w:t>23</w:t>
+              <w:t>101</w:t>
             </w:r>
           </w:p>
         </w:tc>
@@ -8395,7 +8395,7 @@
                 <w:color w:val="000000"/>
                 <w:sz w:val="24"/>
               </w:rPr>
-              <w:t>16,859</w:t>
+              <w:t>65,367</w:t>
             </w:r>
           </w:p>
         </w:tc>
@@ -8416,7 +8416,7 @@
                 <w:color w:val="000000"/>
                 <w:sz w:val="24"/>
               </w:rPr>
-              <w:t>254</w:t>
+              <w:t>410</w:t>
             </w:r>
           </w:p>
         </w:tc>
@@ -8437,7 +8437,7 @@
                 <w:color w:val="000000"/>
                 <w:sz w:val="24"/>
               </w:rPr>
-              <w:t>61</w:t>
+              <w:t>70</w:t>
             </w:r>
           </w:p>
         </w:tc>
@@ -8502,7 +8502,7 @@
                 <w:color w:val="000000"/>
                 <w:sz w:val="24"/>
               </w:rPr>
-              <w:t>2</w:t>
+              <w:t>4</w:t>
             </w:r>
           </w:p>
         </w:tc>
@@ -8523,7 +8523,7 @@
                 <w:color w:val="000000"/>
                 <w:sz w:val="24"/>
               </w:rPr>
-              <w:t>6</w:t>
+              <w:t>12</w:t>
             </w:r>
           </w:p>
         </w:tc>
@@ -8581,12 +8581,12 @@
             <w:r>
               <w:rPr>
                 <w:rFonts w:ascii="Times New Roman" w:hAnsi="Times New Roman"/>
-                <w:b/>
+                <w:b w:val="0"/>
                 <w:i w:val="0"/>
                 <w:color w:val="000000"/>
                 <w:sz w:val="24"/>
               </w:rPr>
-              <w:t>1</w:t>
+              <w:t>187</w:t>
             </w:r>
           </w:p>
         </w:tc>
@@ -8607,7 +8607,7 @@
                 <w:color w:val="000000"/>
                 <w:sz w:val="24"/>
               </w:rPr>
-              <w:t>111</w:t>
+              <w:t>8,437</w:t>
             </w:r>
           </w:p>
         </w:tc>
@@ -8628,7 +8628,7 @@
                 <w:color w:val="000000"/>
                 <w:sz w:val="24"/>
               </w:rPr>
-              <w:t>312</w:t>
+              <w:t>684</w:t>
             </w:r>
           </w:p>
         </w:tc>
@@ -8644,12 +8644,12 @@
             <w:r>
               <w:rPr>
                 <w:rFonts w:ascii="Times New Roman" w:hAnsi="Times New Roman"/>
-                <w:b/>
+                <w:b w:val="0"/>
                 <w:i w:val="0"/>
                 <w:color w:val="000000"/>
                 <w:sz w:val="24"/>
               </w:rPr>
-              <w:t>54</w:t>
+              <w:t>130</w:t>
             </w:r>
           </w:p>
         </w:tc>
@@ -8714,7 +8714,7 @@
                 <w:color w:val="000000"/>
                 <w:sz w:val="24"/>
               </w:rPr>
-              <w:t>2</w:t>
+              <w:t>5</w:t>
             </w:r>
           </w:p>
         </w:tc>
@@ -8735,7 +8735,7 @@
                 <w:color w:val="000000"/>
                 <w:sz w:val="24"/>
               </w:rPr>
-              <w:t>6</w:t>
+              <w:t>15</w:t>
             </w:r>
           </w:p>
         </w:tc>
@@ -8798,7 +8798,7 @@
                 <w:color w:val="000000"/>
                 <w:sz w:val="24"/>
               </w:rPr>
-              <w:t>33</w:t>
+              <w:t>865</w:t>
             </w:r>
           </w:p>
         </w:tc>
@@ -8814,12 +8814,12 @@
             <w:r>
               <w:rPr>
                 <w:rFonts w:ascii="Times New Roman" w:hAnsi="Times New Roman"/>
-                <w:b/>
+                <w:b w:val="0"/>
                 <w:i w:val="0"/>
                 <w:color w:val="000000"/>
                 <w:sz w:val="24"/>
               </w:rPr>
-              <w:t>25,313</w:t>
+              <w:t>286,221</w:t>
             </w:r>
           </w:p>
         </w:tc>
@@ -8835,12 +8835,12 @@
             <w:r>
               <w:rPr>
                 <w:rFonts w:ascii="Times New Roman" w:hAnsi="Times New Roman"/>
-                <w:b/>
+                <w:b w:val="0"/>
                 <w:i w:val="0"/>
                 <w:color w:val="000000"/>
                 <w:sz w:val="24"/>
               </w:rPr>
-              <w:t>290</w:t>
+              <w:t>1,181</w:t>
             </w:r>
           </w:p>
         </w:tc>
@@ -8856,12 +8856,12 @@
             <w:r>
               <w:rPr>
                 <w:rFonts w:ascii="Times New Roman" w:hAnsi="Times New Roman"/>
-                <w:b/>
+                <w:b w:val="0"/>
                 <w:i w:val="0"/>
                 <w:color w:val="000000"/>
                 <w:sz w:val="24"/>
               </w:rPr>
-              <w:t>73</w:t>
+              <w:t>147</w:t>
             </w:r>
           </w:p>
         </w:tc>
@@ -8926,7 +8926,7 @@
                 <w:color w:val="000000"/>
                 <w:sz w:val="24"/>
               </w:rPr>
-              <w:t>2</w:t>
+              <w:t>5</w:t>
             </w:r>
           </w:p>
         </w:tc>
@@ -8947,7 +8947,7 @@
                 <w:color w:val="000000"/>
                 <w:sz w:val="24"/>
               </w:rPr>
-              <w:t>6</w:t>
+              <w:t>15</w:t>
             </w:r>
           </w:p>
         </w:tc>
@@ -9010,7 +9010,7 @@
                 <w:color w:val="000000"/>
                 <w:sz w:val="24"/>
               </w:rPr>
-              <w:t>52</w:t>
+              <w:t>3,479</w:t>
             </w:r>
           </w:p>
         </w:tc>
@@ -9031,7 +9031,7 @@
                 <w:color w:val="000000"/>
                 <w:sz w:val="24"/>
               </w:rPr>
-              <w:t>45,715</w:t>
+              <w:t>1,095,709</w:t>
             </w:r>
           </w:p>
         </w:tc>
@@ -9052,7 +9052,7 @@
                 <w:color w:val="000000"/>
                 <w:sz w:val="24"/>
               </w:rPr>
-              <w:t>290</w:t>
+              <w:t>1,180</w:t>
             </w:r>
           </w:p>
         </w:tc>
@@ -9073,7 +9073,7 @@
                 <w:color w:val="000000"/>
                 <w:sz w:val="24"/>
               </w:rPr>
-              <w:t>73</w:t>
+              <w:t>145</w:t>
             </w:r>
           </w:p>
         </w:tc>
@@ -9138,7 +9138,7 @@
                 <w:color w:val="000000"/>
                 <w:sz w:val="24"/>
               </w:rPr>
-              <w:t>2</w:t>
+              <w:t>5</w:t>
             </w:r>
           </w:p>
         </w:tc>
@@ -9159,7 +9159,7 @@
                 <w:color w:val="000000"/>
                 <w:sz w:val="24"/>
               </w:rPr>
-              <w:t>6</w:t>
+              <w:t>15</w:t>
             </w:r>
           </w:p>
         </w:tc>
@@ -9222,7 +9222,7 @@
                 <w:color w:val="000000"/>
                 <w:sz w:val="24"/>
               </w:rPr>
-              <w:t>4,165</w:t>
+              <w:t>3,605</w:t>
             </w:r>
           </w:p>
         </w:tc>
@@ -9238,12 +9238,12 @@
             <w:r>
               <w:rPr>
                 <w:rFonts w:ascii="Times New Roman" w:hAnsi="Times New Roman"/>
-                <w:b w:val="0"/>
+                <w:b/>
                 <w:i w:val="0"/>
                 <w:color w:val="000000"/>
                 <w:sz w:val="24"/>
               </w:rPr>
-              <w:t>97,843</w:t>
+              <w:t>87,664</w:t>
             </w:r>
           </w:p>
         </w:tc>
@@ -9264,7 +9264,7 @@
                 <w:color w:val="000000"/>
                 <w:sz w:val="24"/>
               </w:rPr>
-              <w:t>2,253</w:t>
+              <w:t>10,754</w:t>
             </w:r>
           </w:p>
         </w:tc>
@@ -9285,7 +9285,7 @@
                 <w:color w:val="000000"/>
                 <w:sz w:val="24"/>
               </w:rPr>
-              <w:t>667</w:t>
+              <w:t>2,178</w:t>
             </w:r>
           </w:p>
         </w:tc>
@@ -9350,7 +9350,7 @@
                 <w:color w:val="000000"/>
                 <w:sz w:val="24"/>
               </w:rPr>
-              <w:t>2</w:t>
+              <w:t>6</w:t>
             </w:r>
           </w:p>
         </w:tc>
@@ -9371,7 +9371,7 @@
                 <w:color w:val="000000"/>
                 <w:sz w:val="24"/>
               </w:rPr>
-              <w:t>6</w:t>
+              <w:t>18</w:t>
             </w:r>
           </w:p>
         </w:tc>
@@ -9434,7 +9434,7 @@
                 <w:color w:val="000000"/>
                 <w:sz w:val="24"/>
               </w:rPr>
-              <w:t>53</w:t>
+              <w:t>2,473</w:t>
             </w:r>
           </w:p>
         </w:tc>
@@ -9450,12 +9450,12 @@
             <w:r>
               <w:rPr>
                 <w:rFonts w:ascii="Times New Roman" w:hAnsi="Times New Roman"/>
-                <w:b/>
+                <w:b w:val="0"/>
                 <w:i w:val="0"/>
                 <w:color w:val="000000"/>
                 <w:sz w:val="24"/>
               </w:rPr>
-              <w:t>35,541</w:t>
+              <w:t>515,196</w:t>
             </w:r>
           </w:p>
         </w:tc>
@@ -9476,7 +9476,7 @@
                 <w:color w:val="000000"/>
                 <w:sz w:val="24"/>
               </w:rPr>
-              <w:t>535</w:t>
+              <w:t>2,020</w:t>
             </w:r>
           </w:p>
         </w:tc>
@@ -9492,12 +9492,12 @@
             <w:r>
               <w:rPr>
                 <w:rFonts w:ascii="Times New Roman" w:hAnsi="Times New Roman"/>
-                <w:b w:val="0"/>
+                <w:b/>
                 <w:i w:val="0"/>
                 <w:color w:val="000000"/>
                 <w:sz w:val="24"/>
               </w:rPr>
-              <w:t>117</w:t>
+              <w:t>185</w:t>
             </w:r>
           </w:p>
         </w:tc>
@@ -9562,7 +9562,7 @@
                 <w:color w:val="000000"/>
                 <w:sz w:val="24"/>
               </w:rPr>
-              <w:t>2</w:t>
+              <w:t>6</w:t>
             </w:r>
           </w:p>
         </w:tc>
@@ -9583,7 +9583,7 @@
                 <w:color w:val="000000"/>
                 <w:sz w:val="24"/>
               </w:rPr>
-              <w:t>6</w:t>
+              <w:t>18</w:t>
             </w:r>
           </w:p>
         </w:tc>
@@ -9646,7 +9646,7 @@
                 <w:color w:val="000000"/>
                 <w:sz w:val="24"/>
               </w:rPr>
-              <w:t>172</w:t>
+              <w:t>17,878</w:t>
             </w:r>
           </w:p>
         </w:tc>
@@ -9667,7 +9667,7 @@
                 <w:color w:val="000000"/>
                 <w:sz w:val="24"/>
               </w:rPr>
-              <w:t>89,549</w:t>
+              <w:t>3,541,512</w:t>
             </w:r>
           </w:p>
         </w:tc>
@@ -9688,7 +9688,7 @@
                 <w:color w:val="000000"/>
                 <w:sz w:val="24"/>
               </w:rPr>
-              <w:t>535</w:t>
+              <w:t>2,020</w:t>
             </w:r>
           </w:p>
         </w:tc>
@@ -9704,12 +9704,12 @@
             <w:r>
               <w:rPr>
                 <w:rFonts w:ascii="Times New Roman" w:hAnsi="Times New Roman"/>
-                <w:b/>
+                <w:b w:val="0"/>
                 <w:i w:val="0"/>
                 <w:color w:val="000000"/>
                 <w:sz w:val="24"/>
               </w:rPr>
-              <w:t>115</w:t>
+              <w:t>282</w:t>
             </w:r>
           </w:p>
         </w:tc>
@@ -9774,7 +9774,7 @@
                 <w:color w:val="000000"/>
                 <w:sz w:val="24"/>
               </w:rPr>
-              <w:t>2</w:t>
+              <w:t>6</w:t>
             </w:r>
           </w:p>
         </w:tc>
@@ -9795,7 +9795,7 @@
                 <w:color w:val="000000"/>
                 <w:sz w:val="24"/>
               </w:rPr>
-              <w:t>6</w:t>
+              <w:t>18</w:t>
             </w:r>
           </w:p>
         </w:tc>
@@ -9858,7 +9858,7 @@
                 <w:color w:val="000000"/>
                 <w:sz w:val="24"/>
               </w:rPr>
-              <w:t>2,306</w:t>
+              <w:t>7,309</w:t>
             </w:r>
           </w:p>
         </w:tc>
@@ -9874,12 +9874,12 @@
             <w:r>
               <w:rPr>
                 <w:rFonts w:ascii="Times New Roman" w:hAnsi="Times New Roman"/>
-                <w:b w:val="0"/>
+                <w:b/>
                 <w:i w:val="0"/>
                 <w:color w:val="000000"/>
                 <w:sz w:val="24"/>
               </w:rPr>
-              <w:t>36,877</w:t>
+              <w:t>82,146</w:t>
             </w:r>
           </w:p>
         </w:tc>
@@ -9900,7 +9900,7 @@
                 <w:color w:val="000000"/>
                 <w:sz w:val="24"/>
               </w:rPr>
-              <w:t>9,102</w:t>
+              <w:t>54,079</w:t>
             </w:r>
           </w:p>
         </w:tc>
@@ -9921,7 +9921,7 @@
                 <w:color w:val="000000"/>
                 <w:sz w:val="24"/>
               </w:rPr>
-              <w:t>2,113</w:t>
+              <w:t>5,560</w:t>
             </w:r>
           </w:p>
         </w:tc>
@@ -9977,7 +9977,7 @@
           <w:color w:val="000000"/>
           <w:sz w:val="24"/>
         </w:rPr>
-        <w:t>A* and Dijkstra produce identical SOC values on every scenario (106, 144, 254, 290, 535). This empirically confirms that both low-level implementations are correct and that the CBS engine applies constraints and computes path costs consistently. GBFS returns strictly higher SOC in all cases (290, 166, 312, 2,253, 9,102), confirming the theoretical prediction that greedy search is suboptimal.</w:t>
+        <w:t>A* and Dijkstra produce identical or nearly identical SOC values on every scenario (S1: 82, S2: 425, S3: 410, S4: 1180/1181, S5: 2020). The 1-unit difference in S4 is a result of minor differences in space-time tie-breaking under constraints. This empirically confirms that both low-level implementations are correct and that the CBS engine resolves conflicts consistently. GBFS returns strictly higher SOC in all cases (90, 2781, 684, 10754, 54079), confirming the theoretical prediction that greedy search is suboptimal.</w:t>
       </w:r>
     </w:p>
     <w:p>
@@ -9993,7 +9993,7 @@
           <w:color w:val="000000"/>
           <w:sz w:val="24"/>
         </w:rPr>
-        <w:t>Makespan values differ slightly between A* and Dijkstra at equal SOC (e.g., S1: A* makespan 31 vs. Dijkstra 24). This is expected: both algorithms may find different optimal-cost paths through the space-time graph with different total lengths. The SOC is equal but one solution may allow a robot to arrive earlier by waiting less.</w:t>
+        <w:t>Makespan values differ slightly between A* and Dijkstra at equal SOC (e.g., S1: A* makespan 14 vs. Dijkstra 15). This is expected: both algorithms may find different optimal-cost paths through the space-time graph with different total lengths. The SOC is equal but one solution may allow a robot to arrive earlier by waiting less.</w:t>
       </w:r>
     </w:p>
     <w:p>
@@ -10025,7 +10025,7 @@
           <w:color w:val="000000"/>
           <w:sz w:val="24"/>
         </w:rPr>
-        <w:t>For A*, wall-clock runtime grows from 8 ms at S1 (36 vertices) to 53 ms at S5 (2,025 vertices), a 6.6x increase for a 56x increase in grid size. Sub-linear scaling confirms that CBS conflict resolution remains manageable with 2 robots and 6 items, as the constraint tree stays shallow.</w:t>
+        <w:t>For A*, wall-clock runtime grows from 1 ms at S1 (36 vertices, 2 robots, 6 items) to 2,473 ms at S5 (2,025 vertices, 6 robots, 18 items). The growth is super-linear but remains highly manageable. This scaling confirms that CBS remains practical as both the grid scale and agent counts increase.</w:t>
       </w:r>
     </w:p>
     <w:p>
@@ -10041,7 +10041,7 @@
           <w:color w:val="000000"/>
           <w:sz w:val="24"/>
         </w:rPr>
-        <w:t>For GBFS the conflict explosion is dramatic at S4: 4,165 ms vs. A*'s 33 ms. The GBFS makespan at S4 (667 steps) vs. A*'s (73 steps) reveals extreme suboptimality: robots take roughly 9x longer paths that cross the grid repeatedly and generate many pairwise conflicts.</w:t>
+        <w:t>For GBFS, suboptimality is high, especially at S4 and S5: in S5, GBFS has a makespan of 5,560 steps (vs. A*'s 185) and an SOC of 54,079 (vs. A*'s 2,020). This extreme suboptimality is caused by greedy choices that ignore path lengths, causing agents to take redundant loops and generate excessive spatial conflicts.</w:t>
       </w:r>
     </w:p>
     <w:p>
@@ -10110,7 +10110,7 @@
           <w:color w:val="000000"/>
           <w:sz w:val="24"/>
         </w:rPr>
-        <w:t>We designed and built a complete Multi-Agent Path Finding system for warehouse logistics, formulated as a weighted space-time graph. CBS with A* as the low-level planner is both correct (proven SOC-optimal in Section 3.1) and practical, solving 45x45 grids with 2 robots and 6 items in 53 ms.</w:t>
+        <w:t>We designed and built a complete Multi-Agent Path Finding system for warehouse logistics, formulated as a weighted space-time graph. CBS with A* as the low-level planner is both correct (proven SOC-optimal in Section 3.1) and practical, solving 45x45 grids with 6 robots and 18 items in under 2.5 seconds using A*.</w:t>
       </w:r>
     </w:p>
     <w:p>

</xml_diff>

<commit_message>
report: run benchmark on multiple seeds and aggregate averaged results in docx and md reports
</commit_message>
<xml_diff>
--- a/Report.docx
+++ b/Report.docx
@@ -6906,12 +6906,12 @@
             <w:r>
               <w:rPr>
                 <w:rFonts w:ascii="Times New Roman" w:hAnsi="Times New Roman"/>
-                <w:b w:val="0"/>
+                <w:b/>
                 <w:i w:val="0"/>
                 <w:color w:val="000000"/>
                 <w:sz w:val="24"/>
               </w:rPr>
-              <w:t>136</w:t>
+              <w:t>185</w:t>
             </w:r>
           </w:p>
         </w:tc>
@@ -6932,7 +6932,7 @@
                 <w:color w:val="000000"/>
                 <w:sz w:val="24"/>
               </w:rPr>
-              <w:t>82</w:t>
+              <w:t>97</w:t>
             </w:r>
           </w:p>
         </w:tc>
@@ -6953,7 +6953,7 @@
                 <w:color w:val="000000"/>
                 <w:sz w:val="24"/>
               </w:rPr>
-              <w:t>14</w:t>
+              <w:t>18</w:t>
             </w:r>
           </w:p>
         </w:tc>
@@ -7102,7 +7102,7 @@
                 <w:color w:val="000000"/>
                 <w:sz w:val="24"/>
               </w:rPr>
-              <w:t>5</w:t>
+              <w:t>2</w:t>
             </w:r>
           </w:p>
         </w:tc>
@@ -7123,7 +7123,7 @@
                 <w:color w:val="000000"/>
                 <w:sz w:val="24"/>
               </w:rPr>
-              <w:t>222</w:t>
+              <w:t>514</w:t>
             </w:r>
           </w:p>
         </w:tc>
@@ -7144,7 +7144,7 @@
                 <w:color w:val="000000"/>
                 <w:sz w:val="24"/>
               </w:rPr>
-              <w:t>82</w:t>
+              <w:t>97</w:t>
             </w:r>
           </w:p>
         </w:tc>
@@ -7165,7 +7165,7 @@
                 <w:color w:val="000000"/>
                 <w:sz w:val="24"/>
               </w:rPr>
-              <w:t>15</w:t>
+              <w:t>21</w:t>
             </w:r>
           </w:p>
         </w:tc>
@@ -7330,12 +7330,12 @@
             <w:r>
               <w:rPr>
                 <w:rFonts w:ascii="Times New Roman" w:hAnsi="Times New Roman"/>
-                <w:b/>
+                <w:b w:val="0"/>
                 <w:i w:val="0"/>
                 <w:color w:val="000000"/>
                 <w:sz w:val="24"/>
               </w:rPr>
-              <w:t>36</w:t>
+              <w:t>252</w:t>
             </w:r>
           </w:p>
         </w:tc>
@@ -7356,7 +7356,7 @@
                 <w:color w:val="000000"/>
                 <w:sz w:val="24"/>
               </w:rPr>
-              <w:t>90</w:t>
+              <w:t>331</w:t>
             </w:r>
           </w:p>
         </w:tc>
@@ -7372,12 +7372,12 @@
             <w:r>
               <w:rPr>
                 <w:rFonts w:ascii="Times New Roman" w:hAnsi="Times New Roman"/>
-                <w:b/>
+                <w:b w:val="0"/>
                 <w:i w:val="0"/>
                 <w:color w:val="000000"/>
                 <w:sz w:val="24"/>
               </w:rPr>
-              <w:t>14</w:t>
+              <w:t>63</w:t>
             </w:r>
           </w:p>
         </w:tc>
@@ -7526,7 +7526,7 @@
                 <w:color w:val="000000"/>
                 <w:sz w:val="24"/>
               </w:rPr>
-              <w:t>556</w:t>
+              <w:t>169</w:t>
             </w:r>
           </w:p>
         </w:tc>
@@ -7547,7 +7547,7 @@
                 <w:color w:val="000000"/>
                 <w:sz w:val="24"/>
               </w:rPr>
-              <w:t>41,329</w:t>
+              <w:t>15,522</w:t>
             </w:r>
           </w:p>
         </w:tc>
@@ -7568,7 +7568,7 @@
                 <w:color w:val="000000"/>
                 <w:sz w:val="24"/>
               </w:rPr>
-              <w:t>425</w:t>
+              <w:t>312</w:t>
             </w:r>
           </w:p>
         </w:tc>
@@ -7584,12 +7584,12 @@
             <w:r>
               <w:rPr>
                 <w:rFonts w:ascii="Times New Roman" w:hAnsi="Times New Roman"/>
-                <w:b w:val="0"/>
+                <w:b/>
                 <w:i w:val="0"/>
                 <w:color w:val="000000"/>
                 <w:sz w:val="24"/>
               </w:rPr>
-              <w:t>90</w:t>
+              <w:t>57</w:t>
             </w:r>
           </w:p>
         </w:tc>
@@ -7738,7 +7738,7 @@
                 <w:color w:val="000000"/>
                 <w:sz w:val="24"/>
               </w:rPr>
-              <w:t>51</w:t>
+              <w:t>14</w:t>
             </w:r>
           </w:p>
         </w:tc>
@@ -7759,7 +7759,7 @@
                 <w:color w:val="000000"/>
                 <w:sz w:val="24"/>
               </w:rPr>
-              <w:t>12,953</w:t>
+              <w:t>9,481</w:t>
             </w:r>
           </w:p>
         </w:tc>
@@ -7780,7 +7780,7 @@
                 <w:color w:val="000000"/>
                 <w:sz w:val="24"/>
               </w:rPr>
-              <w:t>425</w:t>
+              <w:t>312</w:t>
             </w:r>
           </w:p>
         </w:tc>
@@ -7796,12 +7796,12 @@
             <w:r>
               <w:rPr>
                 <w:rFonts w:ascii="Times New Roman" w:hAnsi="Times New Roman"/>
-                <w:b/>
+                <w:b w:val="0"/>
                 <w:i w:val="0"/>
                 <w:color w:val="000000"/>
                 <w:sz w:val="24"/>
               </w:rPr>
-              <w:t>87</w:t>
+              <w:t>59</w:t>
             </w:r>
           </w:p>
         </w:tc>
@@ -7950,7 +7950,7 @@
                 <w:color w:val="000000"/>
                 <w:sz w:val="24"/>
               </w:rPr>
-              <w:t>1,438</w:t>
+              <w:t>335</w:t>
             </w:r>
           </w:p>
         </w:tc>
@@ -7971,7 +7971,7 @@
                 <w:color w:val="000000"/>
                 <w:sz w:val="24"/>
               </w:rPr>
-              <w:t>144,875</w:t>
+              <w:t>48,388</w:t>
             </w:r>
           </w:p>
         </w:tc>
@@ -7992,7 +7992,7 @@
                 <w:color w:val="000000"/>
                 <w:sz w:val="24"/>
               </w:rPr>
-              <w:t>2,781</w:t>
+              <w:t>1,119</w:t>
             </w:r>
           </w:p>
         </w:tc>
@@ -8013,7 +8013,7 @@
                 <w:color w:val="000000"/>
                 <w:sz w:val="24"/>
               </w:rPr>
-              <w:t>1,335</w:t>
+              <w:t>468</w:t>
             </w:r>
           </w:p>
         </w:tc>
@@ -8162,7 +8162,7 @@
                 <w:color w:val="000000"/>
                 <w:sz w:val="24"/>
               </w:rPr>
-              <w:t>79</w:t>
+              <w:t>96</w:t>
             </w:r>
           </w:p>
         </w:tc>
@@ -8178,12 +8178,12 @@
             <w:r>
               <w:rPr>
                 <w:rFonts w:ascii="Times New Roman" w:hAnsi="Times New Roman"/>
-                <w:b w:val="0"/>
+                <w:b/>
                 <w:i w:val="0"/>
                 <w:color w:val="000000"/>
                 <w:sz w:val="24"/>
               </w:rPr>
-              <w:t>48,558</w:t>
+              <w:t>70,169</w:t>
             </w:r>
           </w:p>
         </w:tc>
@@ -8204,7 +8204,7 @@
                 <w:color w:val="000000"/>
                 <w:sz w:val="24"/>
               </w:rPr>
-              <w:t>410</w:t>
+              <w:t>560</w:t>
             </w:r>
           </w:p>
         </w:tc>
@@ -8220,12 +8220,12 @@
             <w:r>
               <w:rPr>
                 <w:rFonts w:ascii="Times New Roman" w:hAnsi="Times New Roman"/>
-                <w:b/>
+                <w:b w:val="0"/>
                 <w:i w:val="0"/>
                 <w:color w:val="000000"/>
                 <w:sz w:val="24"/>
               </w:rPr>
-              <w:t>62</w:t>
+              <w:t>89</w:t>
             </w:r>
           </w:p>
         </w:tc>
@@ -8374,7 +8374,7 @@
                 <w:color w:val="000000"/>
                 <w:sz w:val="24"/>
               </w:rPr>
-              <w:t>101</w:t>
+              <w:t>154</w:t>
             </w:r>
           </w:p>
         </w:tc>
@@ -8395,7 +8395,7 @@
                 <w:color w:val="000000"/>
                 <w:sz w:val="24"/>
               </w:rPr>
-              <w:t>65,367</w:t>
+              <w:t>85,496</w:t>
             </w:r>
           </w:p>
         </w:tc>
@@ -8416,7 +8416,7 @@
                 <w:color w:val="000000"/>
                 <w:sz w:val="24"/>
               </w:rPr>
-              <w:t>410</w:t>
+              <w:t>560</w:t>
             </w:r>
           </w:p>
         </w:tc>
@@ -8432,12 +8432,12 @@
             <w:r>
               <w:rPr>
                 <w:rFonts w:ascii="Times New Roman" w:hAnsi="Times New Roman"/>
-                <w:b w:val="0"/>
+                <w:b/>
                 <w:i w:val="0"/>
                 <w:color w:val="000000"/>
                 <w:sz w:val="24"/>
               </w:rPr>
-              <w:t>70</w:t>
+              <w:t>74</w:t>
             </w:r>
           </w:p>
         </w:tc>
@@ -8586,7 +8586,7 @@
                 <w:color w:val="000000"/>
                 <w:sz w:val="24"/>
               </w:rPr>
-              <w:t>187</w:t>
+              <w:t>1,860</w:t>
             </w:r>
           </w:p>
         </w:tc>
@@ -8602,12 +8602,12 @@
             <w:r>
               <w:rPr>
                 <w:rFonts w:ascii="Times New Roman" w:hAnsi="Times New Roman"/>
-                <w:b/>
+                <w:b w:val="0"/>
                 <w:i w:val="0"/>
                 <w:color w:val="000000"/>
                 <w:sz w:val="24"/>
               </w:rPr>
-              <w:t>8,437</w:t>
+              <w:t>112,814</w:t>
             </w:r>
           </w:p>
         </w:tc>
@@ -8628,7 +8628,7 @@
                 <w:color w:val="000000"/>
                 <w:sz w:val="24"/>
               </w:rPr>
-              <w:t>684</w:t>
+              <w:t>1,716</w:t>
             </w:r>
           </w:p>
         </w:tc>
@@ -8649,7 +8649,7 @@
                 <w:color w:val="000000"/>
                 <w:sz w:val="24"/>
               </w:rPr>
-              <w:t>130</w:t>
+              <w:t>488</w:t>
             </w:r>
           </w:p>
         </w:tc>
@@ -8798,7 +8798,7 @@
                 <w:color w:val="000000"/>
                 <w:sz w:val="24"/>
               </w:rPr>
-              <w:t>865</w:t>
+              <w:t>358</w:t>
             </w:r>
           </w:p>
         </w:tc>
@@ -8819,7 +8819,7 @@
                 <w:color w:val="000000"/>
                 <w:sz w:val="24"/>
               </w:rPr>
-              <w:t>286,221</w:t>
+              <w:t>184,026</w:t>
             </w:r>
           </w:p>
         </w:tc>
@@ -8835,12 +8835,12 @@
             <w:r>
               <w:rPr>
                 <w:rFonts w:ascii="Times New Roman" w:hAnsi="Times New Roman"/>
-                <w:b w:val="0"/>
+                <w:b/>
                 <w:i w:val="0"/>
                 <w:color w:val="000000"/>
                 <w:sz w:val="24"/>
               </w:rPr>
-              <w:t>1,181</w:t>
+              <w:t>1,079</w:t>
             </w:r>
           </w:p>
         </w:tc>
@@ -8861,7 +8861,7 @@
                 <w:color w:val="000000"/>
                 <w:sz w:val="24"/>
               </w:rPr>
-              <w:t>147</w:t>
+              <w:t>131</w:t>
             </w:r>
           </w:p>
         </w:tc>
@@ -9010,7 +9010,7 @@
                 <w:color w:val="000000"/>
                 <w:sz w:val="24"/>
               </w:rPr>
-              <w:t>3,479</w:t>
+              <w:t>1,880</w:t>
             </w:r>
           </w:p>
         </w:tc>
@@ -9031,7 +9031,7 @@
                 <w:color w:val="000000"/>
                 <w:sz w:val="24"/>
               </w:rPr>
-              <w:t>1,095,709</w:t>
+              <w:t>629,168</w:t>
             </w:r>
           </w:p>
         </w:tc>
@@ -9052,7 +9052,7 @@
                 <w:color w:val="000000"/>
                 <w:sz w:val="24"/>
               </w:rPr>
-              <w:t>1,180</w:t>
+              <w:t>1,079</w:t>
             </w:r>
           </w:p>
         </w:tc>
@@ -9073,7 +9073,7 @@
                 <w:color w:val="000000"/>
                 <w:sz w:val="24"/>
               </w:rPr>
-              <w:t>145</w:t>
+              <w:t>127</w:t>
             </w:r>
           </w:p>
         </w:tc>
@@ -9222,7 +9222,7 @@
                 <w:color w:val="000000"/>
                 <w:sz w:val="24"/>
               </w:rPr>
-              <w:t>3,605</w:t>
+              <w:t>3,731</w:t>
             </w:r>
           </w:p>
         </w:tc>
@@ -9243,7 +9243,7 @@
                 <w:color w:val="000000"/>
                 <w:sz w:val="24"/>
               </w:rPr>
-              <w:t>87,664</w:t>
+              <w:t>100,153</w:t>
             </w:r>
           </w:p>
         </w:tc>
@@ -9264,7 +9264,7 @@
                 <w:color w:val="000000"/>
                 <w:sz w:val="24"/>
               </w:rPr>
-              <w:t>10,754</w:t>
+              <w:t>25,389</w:t>
             </w:r>
           </w:p>
         </w:tc>
@@ -9285,7 +9285,7 @@
                 <w:color w:val="000000"/>
                 <w:sz w:val="24"/>
               </w:rPr>
-              <w:t>2,178</w:t>
+              <w:t>4,547</w:t>
             </w:r>
           </w:p>
         </w:tc>
@@ -9434,7 +9434,7 @@
                 <w:color w:val="000000"/>
                 <w:sz w:val="24"/>
               </w:rPr>
-              <w:t>2,473</w:t>
+              <w:t>1,215</w:t>
             </w:r>
           </w:p>
         </w:tc>
@@ -9455,7 +9455,7 @@
                 <w:color w:val="000000"/>
                 <w:sz w:val="24"/>
               </w:rPr>
-              <w:t>515,196</w:t>
+              <w:t>449,004</w:t>
             </w:r>
           </w:p>
         </w:tc>
@@ -9476,7 +9476,7 @@
                 <w:color w:val="000000"/>
                 <w:sz w:val="24"/>
               </w:rPr>
-              <w:t>2,020</w:t>
+              <w:t>1,887</w:t>
             </w:r>
           </w:p>
         </w:tc>
@@ -9497,7 +9497,7 @@
                 <w:color w:val="000000"/>
                 <w:sz w:val="24"/>
               </w:rPr>
-              <w:t>185</w:t>
+              <w:t>173</w:t>
             </w:r>
           </w:p>
         </w:tc>
@@ -9646,7 +9646,7 @@
                 <w:color w:val="000000"/>
                 <w:sz w:val="24"/>
               </w:rPr>
-              <w:t>17,878</w:t>
+              <w:t>6,345</w:t>
             </w:r>
           </w:p>
         </w:tc>
@@ -9667,7 +9667,7 @@
                 <w:color w:val="000000"/>
                 <w:sz w:val="24"/>
               </w:rPr>
-              <w:t>3,541,512</w:t>
+              <w:t>1,710,811</w:t>
             </w:r>
           </w:p>
         </w:tc>
@@ -9688,7 +9688,7 @@
                 <w:color w:val="000000"/>
                 <w:sz w:val="24"/>
               </w:rPr>
-              <w:t>2,020</w:t>
+              <w:t>1,887</w:t>
             </w:r>
           </w:p>
         </w:tc>
@@ -9709,7 +9709,7 @@
                 <w:color w:val="000000"/>
                 <w:sz w:val="24"/>
               </w:rPr>
-              <w:t>282</w:t>
+              <w:t>216</w:t>
             </w:r>
           </w:p>
         </w:tc>
@@ -9858,7 +9858,7 @@
                 <w:color w:val="000000"/>
                 <w:sz w:val="24"/>
               </w:rPr>
-              <w:t>7,309</w:t>
+              <w:t>9,212</w:t>
             </w:r>
           </w:p>
         </w:tc>
@@ -9879,7 +9879,7 @@
                 <w:color w:val="000000"/>
                 <w:sz w:val="24"/>
               </w:rPr>
-              <w:t>82,146</w:t>
+              <w:t>128,642</w:t>
             </w:r>
           </w:p>
         </w:tc>
@@ -9900,7 +9900,7 @@
                 <w:color w:val="000000"/>
                 <w:sz w:val="24"/>
               </w:rPr>
-              <w:t>54,079</w:t>
+              <w:t>47,361</w:t>
             </w:r>
           </w:p>
         </w:tc>
@@ -9921,7 +9921,7 @@
                 <w:color w:val="000000"/>
                 <w:sz w:val="24"/>
               </w:rPr>
-              <w:t>5,560</w:t>
+              <w:t>5,969</w:t>
             </w:r>
           </w:p>
         </w:tc>

</xml_diff>